<commit_message>
docs: verify and synchronize all constants, weights, fees, and state choices in master documentation
</commit_message>
<xml_diff>
--- a/Roomora_Complete_Master_Documentation_v3.docx
+++ b/Roomora_Complete_Master_Documentation_v3.docx
@@ -1909,12 +1909,12 @@
           <w:color w:val="111111"/>
           <w:sz w:val="32"/>
         </w:rPr>
-        <w:t>6. The 8-Dimension AlgorithMIC Roommate Compatibility Engine</w:t>
+        <w:t>6. The 8-Dimension Algorithmic Roommate Compatibility Engine</w:t>
       </w:r>
     </w:p>
     <w:p>
       <w:r>
-        <w:t>In communal student accommodation, toxic or incompatible roommate pairings are the single leading cause of lease terminations, mental distress, and academic disruption. Roomora replaces arbitrary roommate allocation with a proprietary, weighted 8-dimension matching algorithm.</w:t>
+        <w:t>In communal student accommodation, toxic or incompatible roommate pairings are the single leading cause of lease terminations, mental distress, and academic disruption. Roomora replaces arbitrary roommate allocation with a proprietary, weighted multi-factor matching algorithm.</w:t>
       </w:r>
     </w:p>
     <w:p>
@@ -1930,7 +1930,12 @@
           <w:color w:val="1E293B"/>
           <w:sz w:val="26"/>
         </w:rPr>
-        <w:t>6.1 The 8 Weighted Profiling Dimensions</w:t>
+        <w:t>6.1 Weighted Multi-Tier Priority Model</w:t>
+      </w:r>
+    </w:p>
+    <w:p>
+      <w:r>
+        <w:t>The `CompatibilityService` evaluates lifestyle profiles across three distinct mathematical priority tiers (totaling 100%):</w:t>
       </w:r>
     </w:p>
     <w:tbl>
@@ -1974,7 +1979,7 @@
                 <w:color w:val="FFFFFF"/>
                 <w:sz w:val="19"/>
               </w:rPr>
-              <w:t>Dimension</w:t>
+              <w:t>Priority Tier</w:t>
             </w:r>
           </w:p>
         </w:tc>
@@ -2007,7 +2012,7 @@
                 <w:color w:val="FFFFFF"/>
                 <w:sz w:val="19"/>
               </w:rPr>
-              <w:t>Weight</w:t>
+              <w:t>Composite Weight</w:t>
             </w:r>
           </w:p>
         </w:tc>
@@ -2074,7 +2079,7 @@
                 <w:color w:val="282828"/>
                 <w:sz w:val="18"/>
               </w:rPr>
-              <w:t>1. Sleep &amp; Circadian Schedule</w:t>
+              <w:t>High-Priority Tier</w:t>
             </w:r>
           </w:p>
         </w:tc>
@@ -2106,7 +2111,7 @@
                 <w:color w:val="282828"/>
                 <w:sz w:val="18"/>
               </w:rPr>
-              <w:t>18%</w:t>
+              <w:t>70% of Score</w:t>
             </w:r>
           </w:p>
         </w:tc>
@@ -2138,7 +2143,7 @@
                 <w:color w:val="282828"/>
                 <w:sz w:val="18"/>
               </w:rPr>
-              <w:t>Sleep time (Very Early to Very Late), Wake-up time, Alarm reliance, Nighttime light and device activity.</w:t>
+              <w:t>Sleep Schedule (Very Early to Very Late), Wake-Up Time, Cleanliness Level (1–5 scale), Noise Tolerance (Low to Very High), Visitor Frequency (Rarely to Very Frequently), Smoking Tolerance, and Privacy Importance.</w:t>
             </w:r>
           </w:p>
         </w:tc>
@@ -2172,7 +2177,7 @@
                 <w:color w:val="282828"/>
                 <w:sz w:val="18"/>
               </w:rPr>
-              <w:t>2. Cleanliness &amp; Domestic Habits</w:t>
+              <w:t>Medium-Priority Tier</w:t>
             </w:r>
           </w:p>
         </w:tc>
@@ -2204,7 +2209,7 @@
                 <w:color w:val="282828"/>
                 <w:sz w:val="18"/>
               </w:rPr>
-              <w:t>16%</w:t>
+              <w:t>20% of Score</w:t>
             </w:r>
           </w:p>
         </w:tc>
@@ -2236,7 +2241,7 @@
                 <w:color w:val="282828"/>
                 <w:sz w:val="18"/>
               </w:rPr>
-              <w:t>Cleanliness scale (1–5), chore division preferences, cleaning frequency (Daily, Weekly, Monthly), room tidiness expectations.</w:t>
+              <w:t>Study Location (Mainly In-Room vs. Outside Library), Cooking Frequency (Never, Weekly, Daily), and Room Thermal Climate (Very Cold to Very Warm).</w:t>
             </w:r>
           </w:p>
         </w:tc>
@@ -2270,7 +2275,7 @@
                 <w:color w:val="282828"/>
                 <w:sz w:val="18"/>
               </w:rPr>
-              <w:t>3. Noise Tolerance &amp; Social Rhythms</w:t>
+              <w:t>Low-Priority Tier</w:t>
             </w:r>
           </w:p>
         </w:tc>
@@ -2302,7 +2307,7 @@
                 <w:color w:val="282828"/>
                 <w:sz w:val="18"/>
               </w:rPr>
-              <w:t>15%</w:t>
+              <w:t>10% of Score</w:t>
             </w:r>
           </w:p>
         </w:tc>
@@ -2334,497 +2339,7 @@
                 <w:color w:val="282828"/>
                 <w:sz w:val="18"/>
               </w:rPr>
-              <w:t>Preferred study acoustics (Absolute silence vs. Ambient music), volume tolerance, introversion vs. extraversion.</w:t>
-            </w:r>
-          </w:p>
-        </w:tc>
-      </w:tr>
-      <w:tr>
-        <w:tc>
-          <w:tcPr>
-            <w:tcW w:type="dxa" w:w="3120"/>
-            <w:vAlign w:val="center"/>
-            <w:tcMar>
-              <w:top w:w="90" w:type="dxa"/>
-              <w:bottom w:w="90" w:type="dxa"/>
-              <w:left w:w="120" w:type="dxa"/>
-              <w:right w:w="120" w:type="dxa"/>
-            </w:tcMar>
-            <w:tcBorders>
-              <w:top w:val="single" w:sz="4" w:space="0" w:color="E5E7EB"/>
-              <w:left w:val="none"/>
-              <w:bottom w:val="single" w:sz="4" w:space="0" w:color="E5E7EB"/>
-              <w:right w:val="none"/>
-            </w:tcBorders>
-            <w:shd w:fill="F9F9FB"/>
-          </w:tcPr>
-          <w:p>
-            <w:pPr>
-              <w:spacing w:before="60" w:after="60"/>
-            </w:pPr>
-            <w:r>
-              <w:rPr>
-                <w:rFonts w:ascii="Calibri" w:hAnsi="Calibri"/>
-                <w:color w:val="282828"/>
-                <w:sz w:val="18"/>
-              </w:rPr>
-              <w:t>4. Guest &amp; Visitor Protocols</w:t>
-            </w:r>
-          </w:p>
-        </w:tc>
-        <w:tc>
-          <w:tcPr>
-            <w:tcW w:type="dxa" w:w="3120"/>
-            <w:vAlign w:val="center"/>
-            <w:tcMar>
-              <w:top w:w="90" w:type="dxa"/>
-              <w:bottom w:w="90" w:type="dxa"/>
-              <w:left w:w="120" w:type="dxa"/>
-              <w:right w:w="120" w:type="dxa"/>
-            </w:tcMar>
-            <w:tcBorders>
-              <w:top w:val="single" w:sz="4" w:space="0" w:color="E5E7EB"/>
-              <w:left w:val="none"/>
-              <w:bottom w:val="single" w:sz="4" w:space="0" w:color="E5E7EB"/>
-              <w:right w:val="none"/>
-            </w:tcBorders>
-            <w:shd w:fill="F9F9FB"/>
-          </w:tcPr>
-          <w:p>
-            <w:pPr>
-              <w:spacing w:before="60" w:after="60"/>
-            </w:pPr>
-            <w:r>
-              <w:rPr>
-                <w:rFonts w:ascii="Calibri" w:hAnsi="Calibri"/>
-                <w:color w:val="282828"/>
-                <w:sz w:val="18"/>
-              </w:rPr>
-              <w:t>14%</w:t>
-            </w:r>
-          </w:p>
-        </w:tc>
-        <w:tc>
-          <w:tcPr>
-            <w:tcW w:type="dxa" w:w="3120"/>
-            <w:vAlign w:val="center"/>
-            <w:tcMar>
-              <w:top w:w="90" w:type="dxa"/>
-              <w:bottom w:w="90" w:type="dxa"/>
-              <w:left w:w="120" w:type="dxa"/>
-              <w:right w:w="120" w:type="dxa"/>
-            </w:tcMar>
-            <w:tcBorders>
-              <w:top w:val="single" w:sz="4" w:space="0" w:color="E5E7EB"/>
-              <w:left w:val="none"/>
-              <w:bottom w:val="single" w:sz="4" w:space="0" w:color="E5E7EB"/>
-              <w:right w:val="none"/>
-            </w:tcBorders>
-            <w:shd w:fill="F9F9FB"/>
-          </w:tcPr>
-          <w:p>
-            <w:pPr>
-              <w:spacing w:before="60" w:after="60"/>
-            </w:pPr>
-            <w:r>
-              <w:rPr>
-                <w:rFonts w:ascii="Calibri" w:hAnsi="Calibri"/>
-                <w:color w:val="282828"/>
-                <w:sz w:val="18"/>
-              </w:rPr>
-              <w:t>Daytime guest frequency, overnight guest policies, advance notice requirements for bringing visitors.</w:t>
-            </w:r>
-          </w:p>
-        </w:tc>
-      </w:tr>
-      <w:tr>
-        <w:tc>
-          <w:tcPr>
-            <w:tcW w:type="dxa" w:w="3120"/>
-            <w:vAlign w:val="center"/>
-            <w:tcMar>
-              <w:top w:w="90" w:type="dxa"/>
-              <w:bottom w:w="90" w:type="dxa"/>
-              <w:left w:w="120" w:type="dxa"/>
-              <w:right w:w="120" w:type="dxa"/>
-            </w:tcMar>
-            <w:tcBorders>
-              <w:top w:val="single" w:sz="4" w:space="0" w:color="E5E7EB"/>
-              <w:left w:val="none"/>
-              <w:bottom w:val="single" w:sz="4" w:space="0" w:color="E5E7EB"/>
-              <w:right w:val="none"/>
-            </w:tcBorders>
-            <w:shd w:fill="FFFFFF"/>
-          </w:tcPr>
-          <w:p>
-            <w:pPr>
-              <w:spacing w:before="60" w:after="60"/>
-            </w:pPr>
-            <w:r>
-              <w:rPr>
-                <w:rFonts w:ascii="Calibri" w:hAnsi="Calibri"/>
-                <w:color w:val="282828"/>
-                <w:sz w:val="18"/>
-              </w:rPr>
-              <w:t>5. Study Dynamics &amp; Quiet Hours</w:t>
-            </w:r>
-          </w:p>
-        </w:tc>
-        <w:tc>
-          <w:tcPr>
-            <w:tcW w:type="dxa" w:w="3120"/>
-            <w:vAlign w:val="center"/>
-            <w:tcMar>
-              <w:top w:w="90" w:type="dxa"/>
-              <w:bottom w:w="90" w:type="dxa"/>
-              <w:left w:w="120" w:type="dxa"/>
-              <w:right w:w="120" w:type="dxa"/>
-            </w:tcMar>
-            <w:tcBorders>
-              <w:top w:val="single" w:sz="4" w:space="0" w:color="E5E7EB"/>
-              <w:left w:val="none"/>
-              <w:bottom w:val="single" w:sz="4" w:space="0" w:color="E5E7EB"/>
-              <w:right w:val="none"/>
-            </w:tcBorders>
-            <w:shd w:fill="FFFFFF"/>
-          </w:tcPr>
-          <w:p>
-            <w:pPr>
-              <w:spacing w:before="60" w:after="60"/>
-            </w:pPr>
-            <w:r>
-              <w:rPr>
-                <w:rFonts w:ascii="Calibri" w:hAnsi="Calibri"/>
-                <w:color w:val="282828"/>
-                <w:sz w:val="18"/>
-              </w:rPr>
-              <w:t>13%</w:t>
-            </w:r>
-          </w:p>
-        </w:tc>
-        <w:tc>
-          <w:tcPr>
-            <w:tcW w:type="dxa" w:w="3120"/>
-            <w:vAlign w:val="center"/>
-            <w:tcMar>
-              <w:top w:w="90" w:type="dxa"/>
-              <w:bottom w:w="90" w:type="dxa"/>
-              <w:left w:w="120" w:type="dxa"/>
-              <w:right w:w="120" w:type="dxa"/>
-            </w:tcMar>
-            <w:tcBorders>
-              <w:top w:val="single" w:sz="4" w:space="0" w:color="E5E7EB"/>
-              <w:left w:val="none"/>
-              <w:bottom w:val="single" w:sz="4" w:space="0" w:color="E5E7EB"/>
-              <w:right w:val="none"/>
-            </w:tcBorders>
-            <w:shd w:fill="FFFFFF"/>
-          </w:tcPr>
-          <w:p>
-            <w:pPr>
-              <w:spacing w:before="60" w:after="60"/>
-            </w:pPr>
-            <w:r>
-              <w:rPr>
-                <w:rFonts w:ascii="Calibri" w:hAnsi="Calibri"/>
-                <w:color w:val="282828"/>
-                <w:sz w:val="18"/>
-              </w:rPr>
-              <w:t>Study location (In-room desk vs. Library), study hours, adherence to mandatory quiet-hour windows.</w:t>
-            </w:r>
-          </w:p>
-        </w:tc>
-      </w:tr>
-      <w:tr>
-        <w:tc>
-          <w:tcPr>
-            <w:tcW w:type="dxa" w:w="3120"/>
-            <w:vAlign w:val="center"/>
-            <w:tcMar>
-              <w:top w:w="90" w:type="dxa"/>
-              <w:bottom w:w="90" w:type="dxa"/>
-              <w:left w:w="120" w:type="dxa"/>
-              <w:right w:w="120" w:type="dxa"/>
-            </w:tcMar>
-            <w:tcBorders>
-              <w:top w:val="single" w:sz="4" w:space="0" w:color="E5E7EB"/>
-              <w:left w:val="none"/>
-              <w:bottom w:val="single" w:sz="4" w:space="0" w:color="E5E7EB"/>
-              <w:right w:val="none"/>
-            </w:tcBorders>
-            <w:shd w:fill="F9F9FB"/>
-          </w:tcPr>
-          <w:p>
-            <w:pPr>
-              <w:spacing w:before="60" w:after="60"/>
-            </w:pPr>
-            <w:r>
-              <w:rPr>
-                <w:rFonts w:ascii="Calibri" w:hAnsi="Calibri"/>
-                <w:color w:val="282828"/>
-                <w:sz w:val="18"/>
-              </w:rPr>
-              <w:t>6. Kitchen &amp; Food Sharing Ethics</w:t>
-            </w:r>
-          </w:p>
-        </w:tc>
-        <w:tc>
-          <w:tcPr>
-            <w:tcW w:type="dxa" w:w="3120"/>
-            <w:vAlign w:val="center"/>
-            <w:tcMar>
-              <w:top w:w="90" w:type="dxa"/>
-              <w:bottom w:w="90" w:type="dxa"/>
-              <w:left w:w="120" w:type="dxa"/>
-              <w:right w:w="120" w:type="dxa"/>
-            </w:tcMar>
-            <w:tcBorders>
-              <w:top w:val="single" w:sz="4" w:space="0" w:color="E5E7EB"/>
-              <w:left w:val="none"/>
-              <w:bottom w:val="single" w:sz="4" w:space="0" w:color="E5E7EB"/>
-              <w:right w:val="none"/>
-            </w:tcBorders>
-            <w:shd w:fill="F9F9FB"/>
-          </w:tcPr>
-          <w:p>
-            <w:pPr>
-              <w:spacing w:before="60" w:after="60"/>
-            </w:pPr>
-            <w:r>
-              <w:rPr>
-                <w:rFonts w:ascii="Calibri" w:hAnsi="Calibri"/>
-                <w:color w:val="282828"/>
-                <w:sz w:val="18"/>
-              </w:rPr>
-              <w:t>10%</w:t>
-            </w:r>
-          </w:p>
-        </w:tc>
-        <w:tc>
-          <w:tcPr>
-            <w:tcW w:type="dxa" w:w="3120"/>
-            <w:vAlign w:val="center"/>
-            <w:tcMar>
-              <w:top w:w="90" w:type="dxa"/>
-              <w:bottom w:w="90" w:type="dxa"/>
-              <w:left w:w="120" w:type="dxa"/>
-              <w:right w:w="120" w:type="dxa"/>
-            </w:tcMar>
-            <w:tcBorders>
-              <w:top w:val="single" w:sz="4" w:space="0" w:color="E5E7EB"/>
-              <w:left w:val="none"/>
-              <w:bottom w:val="single" w:sz="4" w:space="0" w:color="E5E7EB"/>
-              <w:right w:val="none"/>
-            </w:tcBorders>
-            <w:shd w:fill="F9F9FB"/>
-          </w:tcPr>
-          <w:p>
-            <w:pPr>
-              <w:spacing w:before="60" w:after="60"/>
-            </w:pPr>
-            <w:r>
-              <w:rPr>
-                <w:rFonts w:ascii="Calibri" w:hAnsi="Calibri"/>
-                <w:color w:val="282828"/>
-                <w:sz w:val="18"/>
-              </w:rPr>
-              <w:t>Cooking frequency, kitchen sharing comfort, food labeling vs. open-pantry sharing boundaries.</w:t>
-            </w:r>
-          </w:p>
-        </w:tc>
-      </w:tr>
-      <w:tr>
-        <w:tc>
-          <w:tcPr>
-            <w:tcW w:type="dxa" w:w="3120"/>
-            <w:vAlign w:val="center"/>
-            <w:tcMar>
-              <w:top w:w="90" w:type="dxa"/>
-              <w:bottom w:w="90" w:type="dxa"/>
-              <w:left w:w="120" w:type="dxa"/>
-              <w:right w:w="120" w:type="dxa"/>
-            </w:tcMar>
-            <w:tcBorders>
-              <w:top w:val="single" w:sz="4" w:space="0" w:color="E5E7EB"/>
-              <w:left w:val="none"/>
-              <w:bottom w:val="single" w:sz="4" w:space="0" w:color="E5E7EB"/>
-              <w:right w:val="none"/>
-            </w:tcBorders>
-            <w:shd w:fill="FFFFFF"/>
-          </w:tcPr>
-          <w:p>
-            <w:pPr>
-              <w:spacing w:before="60" w:after="60"/>
-            </w:pPr>
-            <w:r>
-              <w:rPr>
-                <w:rFonts w:ascii="Calibri" w:hAnsi="Calibri"/>
-                <w:color w:val="282828"/>
-                <w:sz w:val="18"/>
-              </w:rPr>
-              <w:t>7. Substance, Alcohol &amp; Smoking</w:t>
-            </w:r>
-          </w:p>
-        </w:tc>
-        <w:tc>
-          <w:tcPr>
-            <w:tcW w:type="dxa" w:w="3120"/>
-            <w:vAlign w:val="center"/>
-            <w:tcMar>
-              <w:top w:w="90" w:type="dxa"/>
-              <w:bottom w:w="90" w:type="dxa"/>
-              <w:left w:w="120" w:type="dxa"/>
-              <w:right w:w="120" w:type="dxa"/>
-            </w:tcMar>
-            <w:tcBorders>
-              <w:top w:val="single" w:sz="4" w:space="0" w:color="E5E7EB"/>
-              <w:left w:val="none"/>
-              <w:bottom w:val="single" w:sz="4" w:space="0" w:color="E5E7EB"/>
-              <w:right w:val="none"/>
-            </w:tcBorders>
-            <w:shd w:fill="FFFFFF"/>
-          </w:tcPr>
-          <w:p>
-            <w:pPr>
-              <w:spacing w:before="60" w:after="60"/>
-            </w:pPr>
-            <w:r>
-              <w:rPr>
-                <w:rFonts w:ascii="Calibri" w:hAnsi="Calibri"/>
-                <w:color w:val="282828"/>
-                <w:sz w:val="18"/>
-              </w:rPr>
-              <w:t>8%</w:t>
-            </w:r>
-          </w:p>
-        </w:tc>
-        <w:tc>
-          <w:tcPr>
-            <w:tcW w:type="dxa" w:w="3120"/>
-            <w:vAlign w:val="center"/>
-            <w:tcMar>
-              <w:top w:w="90" w:type="dxa"/>
-              <w:bottom w:w="90" w:type="dxa"/>
-              <w:left w:w="120" w:type="dxa"/>
-              <w:right w:w="120" w:type="dxa"/>
-            </w:tcMar>
-            <w:tcBorders>
-              <w:top w:val="single" w:sz="4" w:space="0" w:color="E5E7EB"/>
-              <w:left w:val="none"/>
-              <w:bottom w:val="single" w:sz="4" w:space="0" w:color="E5E7EB"/>
-              <w:right w:val="none"/>
-            </w:tcBorders>
-            <w:shd w:fill="FFFFFF"/>
-          </w:tcPr>
-          <w:p>
-            <w:pPr>
-              <w:spacing w:before="60" w:after="60"/>
-            </w:pPr>
-            <w:r>
-              <w:rPr>
-                <w:rFonts w:ascii="Calibri" w:hAnsi="Calibri"/>
-                <w:color w:val="282828"/>
-                <w:sz w:val="18"/>
-              </w:rPr>
-              <w:t>Smoking tolerance (Strict Non-Smoking vs. Outdoor Only), alcohol consumption tolerance, party environment comfort.</w:t>
-            </w:r>
-          </w:p>
-        </w:tc>
-      </w:tr>
-      <w:tr>
-        <w:tc>
-          <w:tcPr>
-            <w:tcW w:type="dxa" w:w="3120"/>
-            <w:vAlign w:val="center"/>
-            <w:tcMar>
-              <w:top w:w="90" w:type="dxa"/>
-              <w:bottom w:w="90" w:type="dxa"/>
-              <w:left w:w="120" w:type="dxa"/>
-              <w:right w:w="120" w:type="dxa"/>
-            </w:tcMar>
-            <w:tcBorders>
-              <w:top w:val="single" w:sz="4" w:space="0" w:color="E5E7EB"/>
-              <w:left w:val="none"/>
-              <w:bottom w:val="single" w:sz="4" w:space="0" w:color="E5E7EB"/>
-              <w:right w:val="none"/>
-            </w:tcBorders>
-            <w:shd w:fill="F9F9FB"/>
-          </w:tcPr>
-          <w:p>
-            <w:pPr>
-              <w:spacing w:before="60" w:after="60"/>
-            </w:pPr>
-            <w:r>
-              <w:rPr>
-                <w:rFonts w:ascii="Calibri" w:hAnsi="Calibri"/>
-                <w:color w:val="282828"/>
-                <w:sz w:val="18"/>
-              </w:rPr>
-              <w:t>8. Thermal Comfort &amp; Room Climate</w:t>
-            </w:r>
-          </w:p>
-        </w:tc>
-        <w:tc>
-          <w:tcPr>
-            <w:tcW w:type="dxa" w:w="3120"/>
-            <w:vAlign w:val="center"/>
-            <w:tcMar>
-              <w:top w:w="90" w:type="dxa"/>
-              <w:bottom w:w="90" w:type="dxa"/>
-              <w:left w:w="120" w:type="dxa"/>
-              <w:right w:w="120" w:type="dxa"/>
-            </w:tcMar>
-            <w:tcBorders>
-              <w:top w:val="single" w:sz="4" w:space="0" w:color="E5E7EB"/>
-              <w:left w:val="none"/>
-              <w:bottom w:val="single" w:sz="4" w:space="0" w:color="E5E7EB"/>
-              <w:right w:val="none"/>
-            </w:tcBorders>
-            <w:shd w:fill="F9F9FB"/>
-          </w:tcPr>
-          <w:p>
-            <w:pPr>
-              <w:spacing w:before="60" w:after="60"/>
-            </w:pPr>
-            <w:r>
-              <w:rPr>
-                <w:rFonts w:ascii="Calibri" w:hAnsi="Calibri"/>
-                <w:color w:val="282828"/>
-                <w:sz w:val="18"/>
-              </w:rPr>
-              <w:t>6%</w:t>
-            </w:r>
-          </w:p>
-        </w:tc>
-        <w:tc>
-          <w:tcPr>
-            <w:tcW w:type="dxa" w:w="3120"/>
-            <w:vAlign w:val="center"/>
-            <w:tcMar>
-              <w:top w:w="90" w:type="dxa"/>
-              <w:bottom w:w="90" w:type="dxa"/>
-              <w:left w:w="120" w:type="dxa"/>
-              <w:right w:w="120" w:type="dxa"/>
-            </w:tcMar>
-            <w:tcBorders>
-              <w:top w:val="single" w:sz="4" w:space="0" w:color="E5E7EB"/>
-              <w:left w:val="none"/>
-              <w:bottom w:val="single" w:sz="4" w:space="0" w:color="E5E7EB"/>
-              <w:right w:val="none"/>
-            </w:tcBorders>
-            <w:shd w:fill="F9F9FB"/>
-          </w:tcPr>
-          <w:p>
-            <w:pPr>
-              <w:spacing w:before="60" w:after="60"/>
-            </w:pPr>
-            <w:r>
-              <w:rPr>
-                <w:rFonts w:ascii="Calibri" w:hAnsi="Calibri"/>
-                <w:color w:val="282828"/>
-                <w:sz w:val="18"/>
-              </w:rPr>
-              <w:t>Air conditioning vs. Fan preference, sleeping temperature preferences, window ventilation habits.</w:t>
+              <w:t>Social Dynamics (Introvert vs. Extravert), Food Sharing Boundaries (Own Items vs. Share Freely), and Borrowing Items (Ask First vs. Never).</w:t>
             </w:r>
           </w:p>
         </w:tc>
@@ -2848,11 +2363,11 @@
     </w:p>
     <w:p>
       <w:r>
-        <w:t>The `CompatibilityService` computes a normalized Compatibility Score (S, 0–100%) between applicant profile A and existing room occupant B:</w:t>
+        <w:t>The `CompatibilityService` computes weighted factor distances between applicant profile A and existing room occupant B:</w:t>
         <w:br/>
-        <w:t>S = 100 - SUM( w_i * |A_i - B_i| / max_diff_i ) * 100</w:t>
+        <w:t>Final Score = (High Priority Avg x 0.70) + (Medium Priority Avg x 0.20) + (Low Priority Avg x 0.10)</w:t>
         <w:br/>
-        <w:t>Where w_i represents the dimension weight and |A_i - B_i| measures the Euclidean/Manhattan distance across normalized categorical answers.</w:t>
+        <w:t>For multi-occupancy rooms (triples, quads), the system calculates all pairwise tenant scores and computes the room composite average.</w:t>
       </w:r>
     </w:p>
     <w:p>
@@ -2871,7 +2386,7 @@
         <w:t xml:space="preserve">Tier 1: Auto-Assignment (Score &gt;= 85%): </w:t>
       </w:r>
       <w:r>
-        <w:t>High compatibility match. The applicant is automatically paired into the room, their profile is temporarily locked, and the booking transitions directly to `PAYMENT_REQUIRED`.</w:t>
+        <w:t>High compatibility match (ROUTING_THRESHOLD = 85). The applicant is automatically paired into the room, their profile is temporarily locked, and the booking transitions directly to `PAYMENT_REQUIRED`.</w:t>
       </w:r>
     </w:p>
     <w:p>
@@ -4370,7 +3885,7 @@
                 <w:color w:val="282828"/>
                 <w:sz w:val="18"/>
               </w:rPr>
-              <w:t>5-day penalty-free move-out window.</w:t>
+              <w:t>7-day penalty-free move-out window (default).</w:t>
             </w:r>
           </w:p>
         </w:tc>
@@ -4402,7 +3917,7 @@
                 <w:color w:val="282828"/>
                 <w:sz w:val="18"/>
               </w:rPr>
-              <w:t>Lease/semester ends; student given 5 days to pack.</w:t>
+              <w:t>Lease/semester ends; student given 7 days to pack.</w:t>
             </w:r>
           </w:p>
         </w:tc>
@@ -4500,7 +4015,7 @@
                 <w:color w:val="282828"/>
                 <w:sz w:val="18"/>
               </w:rPr>
-              <w:t>Grace period expires without departure confirmation; daily penalty accrues.</w:t>
+              <w:t>Grace period expires without departure confirmation; 1.5x daily penalty accrues.</w:t>
             </w:r>
           </w:p>
         </w:tc>
@@ -4766,10 +4281,10 @@
         <w:rPr>
           <w:b/>
         </w:rPr>
-        <w:t xml:space="preserve">Platform Service Fee (e.g. 2%–10%): </w:t>
+        <w:t xml:space="preserve">Platform Service Fee (10%): </w:t>
       </w:r>
       <w:r>
-        <w:t>Explicitly separated fee funding physical property inspections, verification infrastructure, 24/7 emergency support, and escrow management.</w:t>
+        <w:t>Explicitly separated 10% fee (settings.PLATFORM_FEE_PERCENTAGE) funding physical property inspections, verification infrastructure, 24/7 emergency support, and escrow management.</w:t>
       </w:r>
     </w:p>
     <w:p>
@@ -5005,12 +4520,12 @@
           <w:color w:val="1E293B"/>
           <w:sz w:val="26"/>
         </w:rPr>
-        <w:t>10.1 The 5-Day Penalty-Free Grace Period</w:t>
+        <w:t>10.1 The 7-Day Penalty-Free Grace Period</w:t>
       </w:r>
     </w:p>
     <w:p>
       <w:r>
-        <w:t>When the scheduled Move-Out Date arrives, the booking transitions to `GRACE_PERIOD`. The student is granted a 5-day penalty-free window to finalize packing, complete room cleaning, and execute a digital 'Confirm Departure' action on their portal (surrendering keys digitally).</w:t>
+        <w:t>When the scheduled Move-Out Date arrives, the booking transitions to `GRACE_PERIOD`. The student is granted a default 7-day penalty-free window (configurable between 3 to 14 days) to finalize packing, complete room cleaning, and execute a digital 'Confirm Departure' action on their portal (surrendering keys digitally).</w:t>
       </w:r>
     </w:p>
     <w:p>
@@ -5033,9 +4548,9 @@
       <w:r>
         <w:t>If a tenant fails to confirm departure by the conclusion of the Grace Period, the state machine shifts to `OVERSTAY`. The system initiates automated daily financial penalty accrual:</w:t>
         <w:br/>
-        <w:t>Daily Overstay Penalty = (Standard Daily Rate) x 1.5</w:t>
+        <w:t>Daily Overstay Penalty = (Standard Daily Accommodation Rate) x 1.5</w:t>
         <w:br/>
-        <w:t>Penalties are automatically debited against the tenant's ledger and security deposit. Landlords and Admins receive high-priority alerts, and the tenant's platform rebooking eligibility is suspended until full reconciliation.</w:t>
+        <w:t>Penalties are automatically debited against the tenant's ledger and security deposit. Exceeding 15 days in Overstay triggers immediate Administrative Escalation (`OVERSTAY_ESCALATION_DAYS = 15`), and the tenant's platform rebooking eligibility is suspended until full reconciliation.</w:t>
       </w:r>
     </w:p>
     <w:p>

</xml_diff>